<commit_message>
Update calculator manual and metadata with new asset image
Replit-Commit-Author: Agent
</commit_message>
<xml_diff>
--- a/MANUAL_CALCULADORA_BIPV_v2_julio2026.docx
+++ b/MANUAL_CALCULADORA_BIPV_v2_julio2026.docx
@@ -2,6 +2,1296 @@
 <file path=word/document.xml><?xml version="1.0" encoding="utf-8"?>
 <w:document xmlns:wpc="http://schemas.microsoft.com/office/word/2010/wordprocessingCanvas" xmlns:mo="http://schemas.microsoft.com/office/mac/office/2008/main" xmlns:mc="http://schemas.openxmlformats.org/markup-compatibility/2006" xmlns:mv="urn:schemas-microsoft-com:mac:vml" xmlns:o="urn:schemas-microsoft-com:office:office" xmlns:r="http://schemas.openxmlformats.org/officeDocument/2006/relationships" xmlns:m="http://schemas.openxmlformats.org/officeDocument/2006/math" xmlns:v="urn:schemas-microsoft-com:vml" xmlns:wp14="http://schemas.microsoft.com/office/word/2010/wordprocessingDrawing" xmlns:wp="http://schemas.openxmlformats.org/drawingml/2006/wordprocessingDrawing" xmlns:w10="urn:schemas-microsoft-com:office:word" xmlns:w="http://schemas.openxmlformats.org/wordprocessingml/2006/main" xmlns:w14="http://schemas.microsoft.com/office/word/2010/wordml" xmlns:wpg="http://schemas.microsoft.com/office/word/2010/wordprocessingGroup" xmlns:wpi="http://schemas.microsoft.com/office/word/2010/wordprocessingInk" xmlns:wne="http://schemas.microsoft.com/office/word/2006/wordml" xmlns:wps="http://schemas.microsoft.com/office/word/2010/wordprocessingShape" mc:Ignorable="w14 wp14">
   <w:body>
+    <w:p>
+      <w:pPr>
+        <w:pStyle w:val="Heading2"/>
+      </w:pPr>
+      <w:r>
+        <w:rPr>
+          <w:rFonts w:ascii="Calibri" w:hAnsi="Calibri"/>
+          <w:b/>
+          <w:color w:val="1A568C"/>
+          <w:sz w:val="26"/>
+        </w:rPr>
+        <w:t>Guía operativa paso a paso — cómo usar Vista 3D correctamente</w:t>
+      </w:r>
+    </w:p>
+    <w:p>
+      <w:pPr>
+        <w:shd w:val="clear" w:color="auto" w:fill="FFE0CC"/>
+        <w:spacing w:before="80" w:after="80"/>
+        <w:ind w:left="216" w:right="216"/>
+      </w:pPr>
+      <w:r>
+        <w:rPr>
+          <w:rFonts w:ascii="Calibri" w:hAnsi="Calibri"/>
+          <w:sz w:val="20"/>
+        </w:rPr>
+        <w:t>📋  CHECKLIST RÁPIDO: Completa la Fase 1 antes de abrir Vista 3D. Si omites cualquier paso de la Fase 1, algunos botones estarán deshabilitados o los resultados serán 0.</w:t>
+      </w:r>
+    </w:p>
+    <w:p>
+      <w:pPr>
+        <w:pStyle w:val="Heading3"/>
+      </w:pPr>
+      <w:r>
+        <w:rPr>
+          <w:rFonts w:ascii="Calibri" w:hAnsi="Calibri"/>
+          <w:b/>
+          <w:color w:val="206A4A"/>
+          <w:sz w:val="22"/>
+        </w:rPr>
+        <w:t>FASE 1 — Preparación obligatoria (antes de abrir Vista 3D)</w:t>
+      </w:r>
+    </w:p>
+    <w:p>
+      <w:r>
+        <w:rPr>
+          <w:rFonts w:ascii="Calibri" w:hAnsi="Calibri"/>
+          <w:b/>
+          <w:i w:val="0"/>
+          <w:sz w:val="21"/>
+        </w:rPr>
+        <w:t>Paso 1 — Página 1 › Proyecto</w:t>
+      </w:r>
+    </w:p>
+    <w:p>
+      <w:pPr>
+        <w:pStyle w:val="ListBullet"/>
+        <w:ind w:left="360"/>
+      </w:pPr>
+      <w:r>
+        <w:rPr>
+          <w:rFonts w:ascii="Calibri" w:hAnsi="Calibri"/>
+          <w:sz w:val="21"/>
+        </w:rPr>
+        <w:t>Ingresa nombre del proyecto, ciudad y empresa.</w:t>
+      </w:r>
+    </w:p>
+    <w:p>
+      <w:pPr>
+        <w:pStyle w:val="ListBullet"/>
+        <w:ind w:left="360"/>
+      </w:pPr>
+      <w:r>
+        <w:rPr>
+          <w:rFonts w:ascii="Calibri" w:hAnsi="Calibri"/>
+          <w:sz w:val="21"/>
+        </w:rPr>
+        <w:t>Sin esto el reporte PDF no tendrá encabezado.</w:t>
+      </w:r>
+    </w:p>
+    <w:p>
+      <w:r>
+        <w:rPr>
+          <w:rFonts w:ascii="Calibri" w:hAnsi="Calibri"/>
+          <w:b/>
+          <w:i w:val="0"/>
+          <w:color w:val="C00000"/>
+          <w:sz w:val="21"/>
+        </w:rPr>
+        <w:t>Paso 2 — Página 2 › Recurso Solar  ⚠️  OBLIGATORIO para Vista 3D</w:t>
+      </w:r>
+    </w:p>
+    <w:p>
+      <w:pPr>
+        <w:pStyle w:val="ListBullet"/>
+        <w:ind w:left="360"/>
+      </w:pPr>
+      <w:r>
+        <w:rPr>
+          <w:rFonts w:ascii="Calibri" w:hAnsi="Calibri"/>
+          <w:sz w:val="21"/>
+        </w:rPr>
+      </w:r>
+      <w:r>
+        <w:rPr>
+          <w:rFonts w:ascii="Calibri" w:hAnsi="Calibri"/>
+          <w:sz w:val="21"/>
+        </w:rPr>
+        <w:t>Verifica que la ciudad está correcta (coordenadas y altitud visibles en la página).</w:t>
+      </w:r>
+    </w:p>
+    <w:p>
+      <w:pPr>
+        <w:pStyle w:val="ListBullet"/>
+        <w:ind w:left="360"/>
+      </w:pPr>
+      <w:r>
+        <w:rPr>
+          <w:rFonts w:ascii="Calibri" w:hAnsi="Calibri"/>
+          <w:sz w:val="21"/>
+        </w:rPr>
+        <w:t>Configura azimuth y tilt de la fachada principal.</w:t>
+      </w:r>
+    </w:p>
+    <w:p>
+      <w:pPr>
+        <w:pStyle w:val="ListBullet"/>
+        <w:ind w:left="360"/>
+      </w:pPr>
+      <w:r>
+        <w:rPr>
+          <w:rFonts w:ascii="Calibri" w:hAnsi="Calibri"/>
+          <w:sz w:val="21"/>
+        </w:rPr>
+      </w:r>
+      <w:r>
+        <w:rPr>
+          <w:rFonts w:ascii="Calibri" w:hAnsi="Calibri"/>
+          <w:sz w:val="21"/>
+        </w:rPr>
+        <w:t>Clic en «🌐 Descargar TMY de PVGIS y calcular POA» y espera el mensaje ✅ de confirmación.</w:t>
+      </w:r>
+    </w:p>
+    <w:p>
+      <w:pPr>
+        <w:shd w:val="clear" w:color="auto" w:fill="FFF3CD"/>
+        <w:spacing w:before="80" w:after="80"/>
+        <w:ind w:left="216" w:right="216"/>
+      </w:pPr>
+      <w:r>
+        <w:rPr>
+          <w:rFonts w:ascii="Calibri" w:hAnsi="Calibri"/>
+          <w:sz w:val="20"/>
+        </w:rPr>
+        <w:t>Este paso habilita el botón «⚡ Calcular POA para todas las superficies» en Vista 3D. Si no se ejecuta, el botón aparece deshabilitado.</w:t>
+      </w:r>
+    </w:p>
+    <w:p>
+      <w:r>
+        <w:rPr>
+          <w:rFonts w:ascii="Calibri" w:hAnsi="Calibri"/>
+          <w:b/>
+          <w:i w:val="0"/>
+          <w:sz w:val="21"/>
+        </w:rPr>
+        <w:t>Paso 3 — Página 4 › Dimensionamiento</w:t>
+      </w:r>
+    </w:p>
+    <w:p>
+      <w:pPr>
+        <w:pStyle w:val="ListBullet"/>
+        <w:ind w:left="360"/>
+      </w:pPr>
+      <w:r>
+        <w:rPr>
+          <w:rFonts w:ascii="Calibri" w:hAnsi="Calibri"/>
+          <w:sz w:val="21"/>
+        </w:rPr>
+        <w:t>Verifica que η del panel (eficiencia) y PR del sistema estén configurados.</w:t>
+      </w:r>
+    </w:p>
+    <w:p>
+      <w:pPr>
+        <w:shd w:val="clear" w:color="auto" w:fill="FFE0E0"/>
+        <w:spacing w:before="80" w:after="80"/>
+        <w:ind w:left="216" w:right="216"/>
+      </w:pPr>
+      <w:r>
+        <w:rPr>
+          <w:rFonts w:ascii="Calibri" w:hAnsi="Calibri"/>
+          <w:sz w:val="20"/>
+        </w:rPr>
+        <w:t>Si η o PR quedan en 0, la pestaña 📊 Producción mostrará 0 kWh aunque la POA sea correcta.</w:t>
+      </w:r>
+    </w:p>
+    <w:p>
+      <w:pPr>
+        <w:pStyle w:val="Heading3"/>
+      </w:pPr>
+      <w:r>
+        <w:rPr>
+          <w:rFonts w:ascii="Calibri" w:hAnsi="Calibri"/>
+          <w:b/>
+          <w:color w:val="206A4A"/>
+          <w:sz w:val="22"/>
+        </w:rPr>
+        <w:t>FASE 2 — Operar Vista 3D paso a paso</w:t>
+      </w:r>
+    </w:p>
+    <w:p>
+      <w:r>
+        <w:rPr>
+          <w:rFonts w:ascii="Calibri" w:hAnsi="Calibri"/>
+          <w:b/>
+          <w:i w:val="0"/>
+          <w:color w:val="1A568C"/>
+          <w:sz w:val="21"/>
+        </w:rPr>
+        <w:t>Paso 4 — Sub-tab ⚙️  Superficies BIPV</w:t>
+      </w:r>
+    </w:p>
+    <w:p>
+      <w:pPr>
+        <w:pStyle w:val="ListBullet"/>
+        <w:ind w:left="360"/>
+      </w:pPr>
+      <w:r>
+        <w:rPr>
+          <w:rFonts w:ascii="Calibri" w:hAnsi="Calibri"/>
+          <w:sz w:val="21"/>
+        </w:rPr>
+        <w:t>La app carga por defecto la fachada principal del Paso 2. Revisa que esté correcta.</w:t>
+      </w:r>
+    </w:p>
+    <w:p>
+      <w:pPr>
+        <w:pStyle w:val="ListBullet"/>
+        <w:ind w:left="360"/>
+      </w:pPr>
+      <w:r>
+        <w:rPr>
+          <w:rFonts w:ascii="Calibri" w:hAnsi="Calibri"/>
+          <w:sz w:val="21"/>
+        </w:rPr>
+        <w:t>Para agregar una superficie: clic en el botón del tipo que necesites.</w:t>
+      </w:r>
+    </w:p>
+    <w:tbl>
+      <w:tblPr>
+        <w:tblStyle w:val="TableGrid"/>
+        <w:tblW w:type="auto" w:w="0"/>
+        <w:jc w:val="left"/>
+        <w:tblLook w:firstColumn="1" w:firstRow="1" w:lastColumn="0" w:lastRow="0" w:noHBand="0" w:noVBand="1" w:val="04A0"/>
+      </w:tblPr>
+      <w:tblGrid>
+        <w:gridCol w:w="2880"/>
+        <w:gridCol w:w="2880"/>
+        <w:gridCol w:w="2880"/>
+      </w:tblGrid>
+      <w:tr>
+        <w:tc>
+          <w:tcPr>
+            <w:tcW w:type="dxa" w:w="1728"/>
+            <w:shd w:val="clear" w:color="auto" w:fill="1A568C"/>
+          </w:tcPr>
+          <w:p>
+            <w:r>
+              <w:rPr>
+                <w:rFonts w:ascii="Calibri" w:hAnsi="Calibri"/>
+                <w:b/>
+                <w:color w:val="FFFFFF"/>
+                <w:sz w:val="19"/>
+              </w:rPr>
+              <w:t>Botón</w:t>
+            </w:r>
+          </w:p>
+        </w:tc>
+        <w:tc>
+          <w:tcPr>
+            <w:tcW w:type="dxa" w:w="1440"/>
+            <w:shd w:val="clear" w:color="auto" w:fill="1A568C"/>
+          </w:tcPr>
+          <w:p>
+            <w:r>
+              <w:rPr>
+                <w:rFonts w:ascii="Calibri" w:hAnsi="Calibri"/>
+                <w:b/>
+                <w:color w:val="FFFFFF"/>
+                <w:sz w:val="19"/>
+              </w:rPr>
+              <w:t>Tipo</w:t>
+            </w:r>
+          </w:p>
+        </w:tc>
+        <w:tc>
+          <w:tcPr>
+            <w:tcW w:type="dxa" w:w="6048"/>
+            <w:shd w:val="clear" w:color="auto" w:fill="1A568C"/>
+          </w:tcPr>
+          <w:p>
+            <w:r>
+              <w:rPr>
+                <w:rFonts w:ascii="Calibri" w:hAnsi="Calibri"/>
+                <w:b/>
+                <w:color w:val="FFFFFF"/>
+                <w:sz w:val="19"/>
+              </w:rPr>
+              <w:t>Cuándo usarlo</w:t>
+            </w:r>
+          </w:p>
+        </w:tc>
+      </w:tr>
+      <w:tr>
+        <w:tc>
+          <w:tcPr>
+            <w:tcW w:type="dxa" w:w="1728"/>
+            <w:shd w:val="clear" w:color="auto" w:fill="EAF2FB"/>
+          </w:tcPr>
+          <w:p>
+            <w:r>
+              <w:rPr>
+                <w:rFonts w:ascii="Calibri" w:hAnsi="Calibri"/>
+                <w:sz w:val="19"/>
+              </w:rPr>
+              <w:t>🏢 Fachada</w:t>
+            </w:r>
+          </w:p>
+        </w:tc>
+        <w:tc>
+          <w:tcPr>
+            <w:tcW w:type="dxa" w:w="1440"/>
+            <w:shd w:val="clear" w:color="auto" w:fill="EAF2FB"/>
+          </w:tcPr>
+          <w:p>
+            <w:r>
+              <w:rPr>
+                <w:rFonts w:ascii="Calibri" w:hAnsi="Calibri"/>
+                <w:sz w:val="19"/>
+              </w:rPr>
+              <w:t>Fachada</w:t>
+            </w:r>
+          </w:p>
+        </w:tc>
+        <w:tc>
+          <w:tcPr>
+            <w:tcW w:type="dxa" w:w="6048"/>
+            <w:shd w:val="clear" w:color="auto" w:fill="EAF2FB"/>
+          </w:tcPr>
+          <w:p>
+            <w:r>
+              <w:rPr>
+                <w:rFonts w:ascii="Calibri" w:hAnsi="Calibri"/>
+                <w:sz w:val="19"/>
+              </w:rPr>
+              <w:t>Muro vertical con paneles integrados en la envolvente</w:t>
+            </w:r>
+          </w:p>
+        </w:tc>
+      </w:tr>
+      <w:tr>
+        <w:tc>
+          <w:tcPr>
+            <w:tcW w:type="dxa" w:w="1728"/>
+          </w:tcPr>
+          <w:p>
+            <w:r>
+              <w:rPr>
+                <w:rFonts w:ascii="Calibri" w:hAnsi="Calibri"/>
+                <w:sz w:val="19"/>
+              </w:rPr>
+              <w:t>🏠 Techo</w:t>
+            </w:r>
+          </w:p>
+        </w:tc>
+        <w:tc>
+          <w:tcPr>
+            <w:tcW w:type="dxa" w:w="1440"/>
+          </w:tcPr>
+          <w:p>
+            <w:r>
+              <w:rPr>
+                <w:rFonts w:ascii="Calibri" w:hAnsi="Calibri"/>
+                <w:sz w:val="19"/>
+              </w:rPr>
+              <w:t>Techo</w:t>
+            </w:r>
+          </w:p>
+        </w:tc>
+        <w:tc>
+          <w:tcPr>
+            <w:tcW w:type="dxa" w:w="6048"/>
+          </w:tcPr>
+          <w:p>
+            <w:r>
+              <w:rPr>
+                <w:rFonts w:ascii="Calibri" w:hAnsi="Calibri"/>
+                <w:sz w:val="19"/>
+              </w:rPr>
+              <w:t>Cubierta plana (5-15°) o inclinada (15-30°)</w:t>
+            </w:r>
+          </w:p>
+        </w:tc>
+      </w:tr>
+      <w:tr>
+        <w:tc>
+          <w:tcPr>
+            <w:tcW w:type="dxa" w:w="1728"/>
+            <w:shd w:val="clear" w:color="auto" w:fill="EAF2FB"/>
+          </w:tcPr>
+          <w:p>
+            <w:r>
+              <w:rPr>
+                <w:rFonts w:ascii="Calibri" w:hAnsi="Calibri"/>
+                <w:sz w:val="19"/>
+              </w:rPr>
+              <w:t>⛱️ Pérgola</w:t>
+            </w:r>
+          </w:p>
+        </w:tc>
+        <w:tc>
+          <w:tcPr>
+            <w:tcW w:type="dxa" w:w="1440"/>
+            <w:shd w:val="clear" w:color="auto" w:fill="EAF2FB"/>
+          </w:tcPr>
+          <w:p>
+            <w:r>
+              <w:rPr>
+                <w:rFonts w:ascii="Calibri" w:hAnsi="Calibri"/>
+                <w:sz w:val="19"/>
+              </w:rPr>
+              <w:t>Pérgola</w:t>
+            </w:r>
+          </w:p>
+        </w:tc>
+        <w:tc>
+          <w:tcPr>
+            <w:tcW w:type="dxa" w:w="6048"/>
+            <w:shd w:val="clear" w:color="auto" w:fill="EAF2FB"/>
+          </w:tcPr>
+          <w:p>
+            <w:r>
+              <w:rPr>
+                <w:rFonts w:ascii="Calibri" w:hAnsi="Calibri"/>
+                <w:sz w:val="19"/>
+              </w:rPr>
+              <w:t>Estructura horizontal adosada al edificio con postes visibles</w:t>
+            </w:r>
+          </w:p>
+        </w:tc>
+      </w:tr>
+      <w:tr>
+        <w:tc>
+          <w:tcPr>
+            <w:tcW w:type="dxa" w:w="1728"/>
+          </w:tcPr>
+          <w:p>
+            <w:r>
+              <w:rPr>
+                <w:rFonts w:ascii="Calibri" w:hAnsi="Calibri"/>
+                <w:sz w:val="19"/>
+              </w:rPr>
+              <w:t>🏪 Marquesina</w:t>
+            </w:r>
+          </w:p>
+        </w:tc>
+        <w:tc>
+          <w:tcPr>
+            <w:tcW w:type="dxa" w:w="1440"/>
+          </w:tcPr>
+          <w:p>
+            <w:r>
+              <w:rPr>
+                <w:rFonts w:ascii="Calibri" w:hAnsi="Calibri"/>
+                <w:sz w:val="19"/>
+              </w:rPr>
+              <w:t>Marquesina</w:t>
+            </w:r>
+          </w:p>
+        </w:tc>
+        <w:tc>
+          <w:tcPr>
+            <w:tcW w:type="dxa" w:w="6048"/>
+          </w:tcPr>
+          <w:p>
+            <w:r>
+              <w:rPr>
+                <w:rFonts w:ascii="Calibri" w:hAnsi="Calibri"/>
+                <w:sz w:val="19"/>
+              </w:rPr>
+              <w:t>Voladizo inclinado sobre vanos de fachada</w:t>
+            </w:r>
+          </w:p>
+        </w:tc>
+      </w:tr>
+    </w:tbl>
+    <w:p>
+      <w:r>
+        <w:rPr>
+          <w:rFonts w:ascii="Calibri" w:hAnsi="Calibri"/>
+          <w:b w:val="0"/>
+          <w:i w:val="0"/>
+          <w:sz w:val="21"/>
+        </w:rPr>
+      </w:r>
+    </w:p>
+    <w:p>
+      <w:pPr>
+        <w:pStyle w:val="ListBullet"/>
+        <w:ind w:left="360"/>
+      </w:pPr>
+      <w:r>
+        <w:rPr>
+          <w:rFonts w:ascii="Calibri" w:hAnsi="Calibri"/>
+          <w:sz w:val="21"/>
+        </w:rPr>
+        <w:t>Expande cada superficie con el triángulo ► y configura:</w:t>
+      </w:r>
+    </w:p>
+    <w:p>
+      <w:pPr>
+        <w:pStyle w:val="ListBullet"/>
+        <w:ind w:left="720"/>
+      </w:pPr>
+      <w:r>
+        <w:rPr>
+          <w:rFonts w:ascii="Calibri" w:hAnsi="Calibri"/>
+          <w:sz w:val="21"/>
+        </w:rPr>
+        <w:t xml:space="preserve">  → Nombre único (ej: 'Fachada Sur', 'Techo Oficinas')</w:t>
+      </w:r>
+    </w:p>
+    <w:p>
+      <w:pPr>
+        <w:pStyle w:val="ListBullet"/>
+        <w:ind w:left="720"/>
+      </w:pPr>
+      <w:r>
+        <w:rPr>
+          <w:rFonts w:ascii="Calibri" w:hAnsi="Calibri"/>
+          <w:sz w:val="21"/>
+        </w:rPr>
+        <w:t xml:space="preserve">  → Tilt: fachada=90°, techo=10-20°, pérgola=5-10°, marquesina=10-15°</w:t>
+      </w:r>
+    </w:p>
+    <w:p>
+      <w:pPr>
+        <w:pStyle w:val="ListBullet"/>
+        <w:ind w:left="720"/>
+      </w:pPr>
+      <w:r>
+        <w:rPr>
+          <w:rFonts w:ascii="Calibri" w:hAnsi="Calibri"/>
+          <w:sz w:val="21"/>
+        </w:rPr>
+        <w:t xml:space="preserve">  → Azimuth: 0°=Norte · 90°=Este · 180°=Sur · 270°=Oeste</w:t>
+      </w:r>
+    </w:p>
+    <w:p>
+      <w:pPr>
+        <w:pStyle w:val="ListBullet"/>
+        <w:ind w:left="720"/>
+      </w:pPr>
+      <w:r>
+        <w:rPr>
+          <w:rFonts w:ascii="Calibri" w:hAnsi="Calibri"/>
+          <w:sz w:val="21"/>
+        </w:rPr>
+        <w:t xml:space="preserve">  → Área (m²): solo el área activa cubierta con paneles, no el muro total</w:t>
+      </w:r>
+    </w:p>
+    <w:p>
+      <w:pPr>
+        <w:pStyle w:val="ListBullet"/>
+        <w:ind w:left="720"/>
+      </w:pPr>
+      <w:r>
+        <w:rPr>
+          <w:rFonts w:ascii="Calibri" w:hAnsi="Calibri"/>
+          <w:sz w:val="21"/>
+        </w:rPr>
+        <w:t xml:space="preserve">  → Checkbox 'Activa' = ✓</w:t>
+      </w:r>
+    </w:p>
+    <w:p>
+      <w:pPr>
+        <w:pStyle w:val="ListBullet"/>
+        <w:ind w:left="360"/>
+      </w:pPr>
+      <w:r>
+        <w:rPr>
+          <w:rFonts w:ascii="Calibri" w:hAnsi="Calibri"/>
+          <w:sz w:val="21"/>
+        </w:rPr>
+        <w:t>Cuando todas las superficies estén listas: clic en «⚡ Calcular POA para todas las superficies».</w:t>
+      </w:r>
+    </w:p>
+    <w:p>
+      <w:pPr>
+        <w:pStyle w:val="ListBullet"/>
+        <w:ind w:left="360"/>
+      </w:pPr>
+      <w:r>
+        <w:rPr>
+          <w:rFonts w:ascii="Calibri" w:hAnsi="Calibri"/>
+          <w:sz w:val="21"/>
+        </w:rPr>
+        <w:t>Espera el mensaje ✅ con el número de superficies calculadas.</w:t>
+      </w:r>
+    </w:p>
+    <w:p>
+      <w:pPr>
+        <w:shd w:val="clear" w:color="auto" w:fill="FFF3CD"/>
+        <w:spacing w:before="80" w:after="80"/>
+        <w:ind w:left="216" w:right="216"/>
+      </w:pPr>
+      <w:r>
+        <w:rPr>
+          <w:rFonts w:ascii="Calibri" w:hAnsi="Calibri"/>
+          <w:sz w:val="20"/>
+        </w:rPr>
+        <w:t>⚠️  Después de cualquier edición de tilt, azimuth o área: debes volver a ejecutar «⚡ Calcular POA». Los cambios NO se recalculan automáticamente.</w:t>
+      </w:r>
+    </w:p>
+    <w:p>
+      <w:r>
+        <w:rPr>
+          <w:rFonts w:ascii="Calibri" w:hAnsi="Calibri"/>
+          <w:b/>
+          <w:i w:val="0"/>
+          <w:color w:val="1A568C"/>
+          <w:sz w:val="21"/>
+        </w:rPr>
+        <w:t>Paso 5 — Sub-tab 🎨  Vista 3D</w:t>
+      </w:r>
+    </w:p>
+    <w:p>
+      <w:pPr>
+        <w:pStyle w:val="ListBullet"/>
+        <w:ind w:left="360"/>
+      </w:pPr>
+      <w:r>
+        <w:rPr>
+          <w:rFonts w:ascii="Calibri" w:hAnsi="Calibri"/>
+          <w:sz w:val="21"/>
+        </w:rPr>
+        <w:t>Mueve el slider de mes (1-12) para ver cómo varía el recurso solar.</w:t>
+      </w:r>
+    </w:p>
+    <w:p>
+      <w:pPr>
+        <w:pStyle w:val="ListBullet"/>
+        <w:ind w:left="360"/>
+      </w:pPr>
+      <w:r>
+        <w:rPr>
+          <w:rFonts w:ascii="Calibri" w:hAnsi="Calibri"/>
+          <w:sz w:val="21"/>
+        </w:rPr>
+        <w:t>Elige 'Colorear por':</w:t>
+      </w:r>
+    </w:p>
+    <w:p>
+      <w:pPr>
+        <w:pStyle w:val="ListBullet"/>
+        <w:ind w:left="720"/>
+      </w:pPr>
+      <w:r>
+        <w:rPr>
+          <w:rFonts w:ascii="Calibri" w:hAnsi="Calibri"/>
+          <w:sz w:val="21"/>
+        </w:rPr>
+        <w:t xml:space="preserve">  → POA mensual: azul=poco sol, rojo=mucho sol</w:t>
+      </w:r>
+    </w:p>
+    <w:p>
+      <w:pPr>
+        <w:pStyle w:val="ListBullet"/>
+        <w:ind w:left="720"/>
+      </w:pPr>
+      <w:r>
+        <w:rPr>
+          <w:rFonts w:ascii="Calibri" w:hAnsi="Calibri"/>
+          <w:sz w:val="21"/>
+        </w:rPr>
+        <w:t xml:space="preserve">  → FS del CSV: verde=sin sombra, rojo=bypass activo (requiere CSV en Pág. 5)</w:t>
+      </w:r>
+    </w:p>
+    <w:p>
+      <w:pPr>
+        <w:pStyle w:val="ListBullet"/>
+        <w:ind w:left="360"/>
+      </w:pPr>
+      <w:r>
+        <w:rPr>
+          <w:rFonts w:ascii="Calibri" w:hAnsi="Calibri"/>
+          <w:sz w:val="21"/>
+        </w:rPr>
+        <w:t>Ajusta opacidad del edificio a 0.2–0.3 si las superficies de fachada quedan tapadas.</w:t>
+      </w:r>
+    </w:p>
+    <w:p>
+      <w:pPr>
+        <w:pStyle w:val="ListBullet"/>
+        <w:ind w:left="360"/>
+      </w:pPr>
+      <w:r>
+        <w:rPr>
+          <w:rFonts w:ascii="Calibri" w:hAnsi="Calibri"/>
+          <w:sz w:val="21"/>
+        </w:rPr>
+        <w:t>Cambia la vista de cámara para inspeccionar desde distintos ángulos.</w:t>
+      </w:r>
+    </w:p>
+    <w:p>
+      <w:r>
+        <w:rPr>
+          <w:rFonts w:ascii="Calibri" w:hAnsi="Calibri"/>
+          <w:b/>
+          <w:i w:val="0"/>
+          <w:color w:val="1A568C"/>
+          <w:sz w:val="21"/>
+        </w:rPr>
+        <w:t>Paso 6 — Sub-tab 📊  Producción por Superficie</w:t>
+      </w:r>
+    </w:p>
+    <w:p>
+      <w:pPr>
+        <w:pStyle w:val="ListBullet"/>
+        <w:ind w:left="360"/>
+      </w:pPr>
+      <w:r>
+        <w:rPr>
+          <w:rFonts w:ascii="Calibri" w:hAnsi="Calibri"/>
+          <w:sz w:val="21"/>
+        </w:rPr>
+        <w:t>Solo lectura — no requiere acción si la POA fue calculada.</w:t>
+      </w:r>
+    </w:p>
+    <w:tbl>
+      <w:tblPr>
+        <w:tblStyle w:val="TableGrid"/>
+        <w:tblW w:type="auto" w:w="0"/>
+        <w:jc w:val="left"/>
+        <w:tblLook w:firstColumn="1" w:firstRow="1" w:lastColumn="0" w:lastRow="0" w:noHBand="0" w:noVBand="1" w:val="04A0"/>
+      </w:tblPr>
+      <w:tblGrid>
+        <w:gridCol w:w="2880"/>
+        <w:gridCol w:w="2880"/>
+        <w:gridCol w:w="2880"/>
+      </w:tblGrid>
+      <w:tr>
+        <w:tc>
+          <w:tcPr>
+            <w:tcW w:type="dxa" w:w="2592"/>
+            <w:shd w:val="clear" w:color="auto" w:fill="1A568C"/>
+          </w:tcPr>
+          <w:p>
+            <w:r>
+              <w:rPr>
+                <w:rFonts w:ascii="Calibri" w:hAnsi="Calibri"/>
+                <w:b/>
+                <w:color w:val="FFFFFF"/>
+                <w:sz w:val="19"/>
+              </w:rPr>
+              <w:t>Qué verificar</w:t>
+            </w:r>
+          </w:p>
+        </w:tc>
+        <w:tc>
+          <w:tcPr>
+            <w:tcW w:type="dxa" w:w="2880"/>
+            <w:shd w:val="clear" w:color="auto" w:fill="1A568C"/>
+          </w:tcPr>
+          <w:p>
+            <w:r>
+              <w:rPr>
+                <w:rFonts w:ascii="Calibri" w:hAnsi="Calibri"/>
+                <w:b/>
+                <w:color w:val="FFFFFF"/>
+                <w:sz w:val="19"/>
+              </w:rPr>
+              <w:t>Señal normal</w:t>
+            </w:r>
+          </w:p>
+        </w:tc>
+        <w:tc>
+          <w:tcPr>
+            <w:tcW w:type="dxa" w:w="3744"/>
+            <w:shd w:val="clear" w:color="auto" w:fill="1A568C"/>
+          </w:tcPr>
+          <w:p>
+            <w:r>
+              <w:rPr>
+                <w:rFonts w:ascii="Calibri" w:hAnsi="Calibri"/>
+                <w:b/>
+                <w:color w:val="FFFFFF"/>
+                <w:sz w:val="19"/>
+              </w:rPr>
+              <w:t>Señal de problema</w:t>
+            </w:r>
+          </w:p>
+        </w:tc>
+      </w:tr>
+      <w:tr>
+        <w:tc>
+          <w:tcPr>
+            <w:tcW w:type="dxa" w:w="2592"/>
+            <w:shd w:val="clear" w:color="auto" w:fill="EAF2FB"/>
+          </w:tcPr>
+          <w:p>
+            <w:r>
+              <w:rPr>
+                <w:rFonts w:ascii="Calibri" w:hAnsi="Calibri"/>
+                <w:sz w:val="19"/>
+              </w:rPr>
+              <w:t>Barras apiladas</w:t>
+            </w:r>
+          </w:p>
+        </w:tc>
+        <w:tc>
+          <w:tcPr>
+            <w:tcW w:type="dxa" w:w="2880"/>
+            <w:shd w:val="clear" w:color="auto" w:fill="EAF2FB"/>
+          </w:tcPr>
+          <w:p>
+            <w:r>
+              <w:rPr>
+                <w:rFonts w:ascii="Calibri" w:hAnsi="Calibri"/>
+                <w:sz w:val="19"/>
+              </w:rPr>
+              <w:t>Altura &gt; 0 en todos los meses</w:t>
+            </w:r>
+          </w:p>
+        </w:tc>
+        <w:tc>
+          <w:tcPr>
+            <w:tcW w:type="dxa" w:w="3744"/>
+            <w:shd w:val="clear" w:color="auto" w:fill="EAF2FB"/>
+          </w:tcPr>
+          <w:p>
+            <w:r>
+              <w:rPr>
+                <w:rFonts w:ascii="Calibri" w:hAnsi="Calibri"/>
+                <w:sz w:val="19"/>
+              </w:rPr>
+              <w:t>Todo en 0 → η o PR = 0 (revisar Pág. 4)</w:t>
+            </w:r>
+          </w:p>
+        </w:tc>
+      </w:tr>
+      <w:tr>
+        <w:tc>
+          <w:tcPr>
+            <w:tcW w:type="dxa" w:w="2592"/>
+          </w:tcPr>
+          <w:p>
+            <w:r>
+              <w:rPr>
+                <w:rFonts w:ascii="Calibri" w:hAnsi="Calibri"/>
+                <w:sz w:val="19"/>
+              </w:rPr>
+              <w:t>POA anual</w:t>
+            </w:r>
+          </w:p>
+        </w:tc>
+        <w:tc>
+          <w:tcPr>
+            <w:tcW w:type="dxa" w:w="2880"/>
+          </w:tcPr>
+          <w:p>
+            <w:r>
+              <w:rPr>
+                <w:rFonts w:ascii="Calibri" w:hAnsi="Calibri"/>
+                <w:sz w:val="19"/>
+              </w:rPr>
+              <w:t>&gt; 100 kWh/m²/año para fachadas sur</w:t>
+            </w:r>
+          </w:p>
+        </w:tc>
+        <w:tc>
+          <w:tcPr>
+            <w:tcW w:type="dxa" w:w="3744"/>
+          </w:tcPr>
+          <w:p>
+            <w:r>
+              <w:rPr>
+                <w:rFonts w:ascii="Calibri" w:hAnsi="Calibri"/>
+                <w:sz w:val="19"/>
+              </w:rPr>
+              <w:t>= 0 → POA no calculada en ⚙️</w:t>
+            </w:r>
+          </w:p>
+        </w:tc>
+      </w:tr>
+      <w:tr>
+        <w:tc>
+          <w:tcPr>
+            <w:tcW w:type="dxa" w:w="2592"/>
+            <w:shd w:val="clear" w:color="auto" w:fill="EAF2FB"/>
+          </w:tcPr>
+          <w:p>
+            <w:r>
+              <w:rPr>
+                <w:rFonts w:ascii="Calibri" w:hAnsi="Calibri"/>
+                <w:sz w:val="19"/>
+              </w:rPr>
+              <w:t>% del total</w:t>
+            </w:r>
+          </w:p>
+        </w:tc>
+        <w:tc>
+          <w:tcPr>
+            <w:tcW w:type="dxa" w:w="2880"/>
+            <w:shd w:val="clear" w:color="auto" w:fill="EAF2FB"/>
+          </w:tcPr>
+          <w:p>
+            <w:r>
+              <w:rPr>
+                <w:rFonts w:ascii="Calibri" w:hAnsi="Calibri"/>
+                <w:sz w:val="19"/>
+              </w:rPr>
+              <w:t>Suma exacta 100% entre activas</w:t>
+            </w:r>
+          </w:p>
+        </w:tc>
+        <w:tc>
+          <w:tcPr>
+            <w:tcW w:type="dxa" w:w="3744"/>
+            <w:shd w:val="clear" w:color="auto" w:fill="EAF2FB"/>
+          </w:tcPr>
+          <w:p>
+            <w:r>
+              <w:rPr>
+                <w:rFonts w:ascii="Calibri" w:hAnsi="Calibri"/>
+                <w:sz w:val="19"/>
+              </w:rPr>
+              <w:t>No suma 100% → hay inactivas no contabilizadas</w:t>
+            </w:r>
+          </w:p>
+        </w:tc>
+      </w:tr>
+      <w:tr>
+        <w:tc>
+          <w:tcPr>
+            <w:tcW w:type="dxa" w:w="2592"/>
+          </w:tcPr>
+          <w:p>
+            <w:r>
+              <w:rPr>
+                <w:rFonts w:ascii="Calibri" w:hAnsi="Calibri"/>
+                <w:sz w:val="19"/>
+              </w:rPr>
+              <w:t>FS mensual (si hay CSV)</w:t>
+            </w:r>
+          </w:p>
+        </w:tc>
+        <w:tc>
+          <w:tcPr>
+            <w:tcW w:type="dxa" w:w="2880"/>
+          </w:tcPr>
+          <w:p>
+            <w:r>
+              <w:rPr>
+                <w:rFonts w:ascii="Calibri" w:hAnsi="Calibri"/>
+                <w:sz w:val="19"/>
+              </w:rPr>
+              <w:t>Curvas diferenciadas por superficie</w:t>
+            </w:r>
+          </w:p>
+        </w:tc>
+        <w:tc>
+          <w:tcPr>
+            <w:tcW w:type="dxa" w:w="3744"/>
+          </w:tcPr>
+          <w:p>
+            <w:r>
+              <w:rPr>
+                <w:rFonts w:ascii="Calibri" w:hAnsi="Calibri"/>
+                <w:sz w:val="19"/>
+              </w:rPr>
+              <w:t>Todas iguales → no se asignó columna Fachada del CSV</w:t>
+            </w:r>
+          </w:p>
+        </w:tc>
+      </w:tr>
+    </w:tbl>
+    <w:p>
+      <w:r>
+        <w:rPr>
+          <w:rFonts w:ascii="Calibri" w:hAnsi="Calibri"/>
+          <w:b/>
+          <w:i w:val="0"/>
+          <w:color w:val="1A568C"/>
+          <w:sz w:val="21"/>
+        </w:rPr>
+        <w:t>Paso 7 — Sub-tab 🌞  Trayectoria Solar</w:t>
+      </w:r>
+    </w:p>
+    <w:p>
+      <w:pPr>
+        <w:pStyle w:val="ListBullet"/>
+        <w:ind w:left="360"/>
+      </w:pPr>
+      <w:r>
+        <w:rPr>
+          <w:rFonts w:ascii="Calibri" w:hAnsi="Calibri"/>
+          <w:sz w:val="21"/>
+        </w:rPr>
+        <w:t>Verás una línea vertical de color diferente por cada superficie activa.</w:t>
+      </w:r>
+    </w:p>
+    <w:p>
+      <w:pPr>
+        <w:pStyle w:val="ListBullet"/>
+        <w:ind w:left="360"/>
+      </w:pPr>
+      <w:r>
+        <w:rPr>
+          <w:rFonts w:ascii="Calibri" w:hAnsi="Calibri"/>
+          <w:sz w:val="21"/>
+        </w:rPr>
+        <w:t>Si hay múltiples superficies: selecciona cuál analizar en el selector de heatmap.</w:t>
+      </w:r>
+    </w:p>
+    <w:p>
+      <w:pPr>
+        <w:pStyle w:val="ListBullet"/>
+        <w:ind w:left="360"/>
+      </w:pPr>
+      <w:r>
+        <w:rPr>
+          <w:rFonts w:ascii="Calibri" w:hAnsi="Calibri"/>
+          <w:sz w:val="21"/>
+        </w:rPr>
+        <w:t>Lee las métricas: horas productivas, sombreadas, sin vista fachada.</w:t>
+      </w:r>
+    </w:p>
+    <w:p>
+      <w:pPr>
+        <w:pStyle w:val="Heading3"/>
+      </w:pPr>
+      <w:r>
+        <w:rPr>
+          <w:rFonts w:ascii="Calibri" w:hAnsi="Calibri"/>
+          <w:b/>
+          <w:color w:val="206A4A"/>
+          <w:sz w:val="22"/>
+        </w:rPr>
+        <w:t>Regla de oro — Lo que NO hacer</w:t>
+      </w:r>
+    </w:p>
+    <w:tbl>
+      <w:tblPr>
+        <w:tblStyle w:val="TableGrid"/>
+        <w:tblW w:type="auto" w:w="0"/>
+        <w:jc w:val="left"/>
+        <w:tblLook w:firstColumn="1" w:firstRow="1" w:lastColumn="0" w:lastRow="0" w:noHBand="0" w:noVBand="1" w:val="04A0"/>
+      </w:tblPr>
+      <w:tblGrid>
+        <w:gridCol w:w="4320"/>
+        <w:gridCol w:w="4320"/>
+      </w:tblGrid>
+      <w:tr>
+        <w:tc>
+          <w:tcPr>
+            <w:tcW w:type="dxa" w:w="3744"/>
+            <w:shd w:val="clear" w:color="auto" w:fill="1A568C"/>
+          </w:tcPr>
+          <w:p>
+            <w:r>
+              <w:rPr>
+                <w:rFonts w:ascii="Calibri" w:hAnsi="Calibri"/>
+                <w:b/>
+                <w:color w:val="FFFFFF"/>
+                <w:sz w:val="19"/>
+              </w:rPr>
+              <w:t>❌ Error frecuente</w:t>
+            </w:r>
+          </w:p>
+        </w:tc>
+        <w:tc>
+          <w:tcPr>
+            <w:tcW w:type="dxa" w:w="5472"/>
+            <w:shd w:val="clear" w:color="auto" w:fill="1A568C"/>
+          </w:tcPr>
+          <w:p>
+            <w:r>
+              <w:rPr>
+                <w:rFonts w:ascii="Calibri" w:hAnsi="Calibri"/>
+                <w:b/>
+                <w:color w:val="FFFFFF"/>
+                <w:sz w:val="19"/>
+              </w:rPr>
+              <w:t>✅ Solución correcta</w:t>
+            </w:r>
+          </w:p>
+        </w:tc>
+      </w:tr>
+      <w:tr>
+        <w:tc>
+          <w:tcPr>
+            <w:tcW w:type="dxa" w:w="3744"/>
+            <w:shd w:val="clear" w:color="auto" w:fill="EAF2FB"/>
+          </w:tcPr>
+          <w:p>
+            <w:r>
+              <w:rPr>
+                <w:rFonts w:ascii="Calibri" w:hAnsi="Calibri"/>
+                <w:sz w:val="19"/>
+              </w:rPr>
+              <w:t>Recargar el navegador (F5) durante la sesión</w:t>
+            </w:r>
+          </w:p>
+        </w:tc>
+        <w:tc>
+          <w:tcPr>
+            <w:tcW w:type="dxa" w:w="5472"/>
+            <w:shd w:val="clear" w:color="auto" w:fill="EAF2FB"/>
+          </w:tcPr>
+          <w:p>
+            <w:r>
+              <w:rPr>
+                <w:rFonts w:ascii="Calibri" w:hAnsi="Calibri"/>
+                <w:sz w:val="19"/>
+              </w:rPr>
+              <w:t>Usar SIEMPRE la barra lateral de navegación; F5 borra toda la sesión</w:t>
+            </w:r>
+          </w:p>
+        </w:tc>
+      </w:tr>
+      <w:tr>
+        <w:tc>
+          <w:tcPr>
+            <w:tcW w:type="dxa" w:w="3744"/>
+          </w:tcPr>
+          <w:p>
+            <w:r>
+              <w:rPr>
+                <w:rFonts w:ascii="Calibri" w:hAnsi="Calibri"/>
+                <w:sz w:val="19"/>
+              </w:rPr>
+              <w:t>Ir a 📊 Producción sin calcular POA en ⚙️</w:t>
+            </w:r>
+          </w:p>
+        </w:tc>
+        <w:tc>
+          <w:tcPr>
+            <w:tcW w:type="dxa" w:w="5472"/>
+          </w:tcPr>
+          <w:p>
+            <w:r>
+              <w:rPr>
+                <w:rFonts w:ascii="Calibri" w:hAnsi="Calibri"/>
+                <w:sz w:val="19"/>
+              </w:rPr>
+              <w:t>Terminar siempre en ⚙️ con el botón azul ejecutado y confirmado</w:t>
+            </w:r>
+          </w:p>
+        </w:tc>
+      </w:tr>
+      <w:tr>
+        <w:tc>
+          <w:tcPr>
+            <w:tcW w:type="dxa" w:w="3744"/>
+            <w:shd w:val="clear" w:color="auto" w:fill="EAF2FB"/>
+          </w:tcPr>
+          <w:p>
+            <w:r>
+              <w:rPr>
+                <w:rFonts w:ascii="Calibri" w:hAnsi="Calibri"/>
+                <w:sz w:val="19"/>
+              </w:rPr>
+              <w:t>Dos superficies con el mismo nombre</w:t>
+            </w:r>
+          </w:p>
+        </w:tc>
+        <w:tc>
+          <w:tcPr>
+            <w:tcW w:type="dxa" w:w="5472"/>
+            <w:shd w:val="clear" w:color="auto" w:fill="EAF2FB"/>
+          </w:tcPr>
+          <w:p>
+            <w:r>
+              <w:rPr>
+                <w:rFonts w:ascii="Calibri" w:hAnsi="Calibri"/>
+                <w:sz w:val="19"/>
+              </w:rPr>
+              <w:t>Nombres únicos: 'Fachada Sur', 'Fachada Este', 'Techo Principal'</w:t>
+            </w:r>
+          </w:p>
+        </w:tc>
+      </w:tr>
+      <w:tr>
+        <w:tc>
+          <w:tcPr>
+            <w:tcW w:type="dxa" w:w="3744"/>
+          </w:tcPr>
+          <w:p>
+            <w:r>
+              <w:rPr>
+                <w:rFonts w:ascii="Calibri" w:hAnsi="Calibri"/>
+                <w:sz w:val="19"/>
+              </w:rPr>
+              <w:t>Cambiar tilt/azimuth y no recalcular POA</w:t>
+            </w:r>
+          </w:p>
+        </w:tc>
+        <w:tc>
+          <w:tcPr>
+            <w:tcW w:type="dxa" w:w="5472"/>
+          </w:tcPr>
+          <w:p>
+            <w:r>
+              <w:rPr>
+                <w:rFonts w:ascii="Calibri" w:hAnsi="Calibri"/>
+                <w:sz w:val="19"/>
+              </w:rPr>
+              <w:t>Después de cualquier edición → volver a ejecutar ⚡ Calcular POA</w:t>
+            </w:r>
+          </w:p>
+        </w:tc>
+      </w:tr>
+      <w:tr>
+        <w:tc>
+          <w:tcPr>
+            <w:tcW w:type="dxa" w:w="3744"/>
+            <w:shd w:val="clear" w:color="auto" w:fill="EAF2FB"/>
+          </w:tcPr>
+          <w:p>
+            <w:r>
+              <w:rPr>
+                <w:rFonts w:ascii="Calibri" w:hAnsi="Calibri"/>
+                <w:sz w:val="19"/>
+              </w:rPr>
+              <w:t>Usar 'FS del CSV' sin haber cargado CSV en Pág. 5</w:t>
+            </w:r>
+          </w:p>
+        </w:tc>
+        <w:tc>
+          <w:tcPr>
+            <w:tcW w:type="dxa" w:w="5472"/>
+            <w:shd w:val="clear" w:color="auto" w:fill="EAF2FB"/>
+          </w:tcPr>
+          <w:p>
+            <w:r>
+              <w:rPr>
+                <w:rFonts w:ascii="Calibri" w:hAnsi="Calibri"/>
+                <w:sz w:val="19"/>
+              </w:rPr>
+              <w:t>El modo vuelve a POA automáticamente, pero sin FS no hay análisis de bypass</w:t>
+            </w:r>
+          </w:p>
+        </w:tc>
+      </w:tr>
+      <w:tr>
+        <w:tc>
+          <w:tcPr>
+            <w:tcW w:type="dxa" w:w="3744"/>
+          </w:tcPr>
+          <w:p>
+            <w:r>
+              <w:rPr>
+                <w:rFonts w:ascii="Calibri" w:hAnsi="Calibri"/>
+                <w:sz w:val="19"/>
+              </w:rPr>
+              <w:t>Área = 0 o vacía</w:t>
+            </w:r>
+          </w:p>
+        </w:tc>
+        <w:tc>
+          <w:tcPr>
+            <w:tcW w:type="dxa" w:w="5472"/>
+          </w:tcPr>
+          <w:p>
+            <w:r>
+              <w:rPr>
+                <w:rFonts w:ascii="Calibri" w:hAnsi="Calibri"/>
+                <w:sz w:val="19"/>
+              </w:rPr>
+              <w:t>Mínimo 1 m²; la producción es proporcional al área</w:t>
+            </w:r>
+          </w:p>
+        </w:tc>
+      </w:tr>
+    </w:tbl>
+    <w:sectPr>
+      <w:pgSz w:w="12240" w:h="15840"/>
+      <w:pgMar w:top="1440" w:right="1800" w:bottom="1440" w:left="1800" w:header="720" w:footer="720" w:gutter="0"/>
+      <w:cols w:space="720"/>
+      <w:docGrid w:linePitch="360"/>
+    </w:sectPr>
     <w:p>
       <w:pPr>
         <w:jc w:val="center"/>
@@ -848,13 +2138,22 @@
       <w:pPr>
         <w:pStyle w:val="ListBullet"/>
         <w:ind w:left="360"/>
+        <w:shd w:val="clear" w:color="auto" w:fill="D5F5E3"/>
       </w:pPr>
       <w:r>
         <w:rPr>
           <w:rFonts w:ascii="Calibri" w:hAnsi="Calibri"/>
           <w:sz w:val="21"/>
         </w:rPr>
-        <w:t>1. Cargar archivo EPW desde https://energyplus.net/weather</w:t>
+      </w:r>
+      <w:r>
+        <w:rPr>
+          <w:rFonts w:ascii="Calibri" w:hAnsi="Calibri"/>
+          <w:b/>
+          <w:color w:val="206A4A"/>
+          <w:sz w:val="20"/>
+        </w:rPr>
+        <w:t>✅  DATOS CLIMÁTICOS INTEGRADOS: La app descarga el TMY directamente desde PVGIS (Comisión Europea). NO necesitas descargar ningún archivo EPW manualmente.</w:t>
       </w:r>
     </w:p>
     <w:p>
@@ -880,7 +2179,13 @@
           <w:rFonts w:ascii="Calibri" w:hAnsi="Calibri"/>
           <w:sz w:val="21"/>
         </w:rPr>
-        <w:t>3. Clic en «Calcular POA» — calcula las 8 760 horas del año</w:t>
+      </w:r>
+      <w:r>
+        <w:rPr>
+          <w:rFonts w:ascii="Calibri" w:hAnsi="Calibri"/>
+          <w:sz w:val="21"/>
+        </w:rPr>
+        <w:t>Clic en «🌐 Descargar TMY de PVGIS y calcular POA» y espera el mensaje ✅ de confirmación.</w:t>
       </w:r>
     </w:p>
     <w:p>
@@ -10327,7 +11632,7 @@
       <w:outlineLvl w:val="0"/>
     </w:pPr>
     <w:rPr>
-      <w:rFonts w:asciiTheme="majorHAnsi" w:eastAsiaTheme="majorEastAsia" w:hAnsiTheme="majorHAnsi" w:cstheme="majorBidi"/>
+      <w:rFonts w:asciiTheme="majorHAnsi" w:eastAsiaTheme="majorEastAsia" w:hAnsiTheme="majorHAnsi" w:cstheme="majorBidi" w:ascii="Calibri" w:hAnsi="Calibri"/>
       <w:b/>
       <w:bCs/>
       <w:color w:val="365F91" w:themeColor="accent1" w:themeShade="BF"/>
@@ -10351,7 +11656,7 @@
       <w:outlineLvl w:val="1"/>
     </w:pPr>
     <w:rPr>
-      <w:rFonts w:asciiTheme="majorHAnsi" w:eastAsiaTheme="majorEastAsia" w:hAnsiTheme="majorHAnsi" w:cstheme="majorBidi"/>
+      <w:rFonts w:asciiTheme="majorHAnsi" w:eastAsiaTheme="majorEastAsia" w:hAnsiTheme="majorHAnsi" w:cstheme="majorBidi" w:ascii="Calibri" w:hAnsi="Calibri"/>
       <w:b/>
       <w:bCs/>
       <w:color w:val="4F81BD" w:themeColor="accent1"/>
@@ -10375,7 +11680,7 @@
       <w:outlineLvl w:val="2"/>
     </w:pPr>
     <w:rPr>
-      <w:rFonts w:asciiTheme="majorHAnsi" w:eastAsiaTheme="majorEastAsia" w:hAnsiTheme="majorHAnsi" w:cstheme="majorBidi"/>
+      <w:rFonts w:asciiTheme="majorHAnsi" w:eastAsiaTheme="majorEastAsia" w:hAnsiTheme="majorHAnsi" w:cstheme="majorBidi" w:ascii="Calibri" w:hAnsi="Calibri"/>
       <w:b/>
       <w:bCs/>
       <w:color w:val="4F81BD" w:themeColor="accent1"/>

</xml_diff>

<commit_message>
Update agent metadata and documentation draft
Replit-Commit-Author: Agent
</commit_message>
<xml_diff>
--- a/MANUAL_CALCULADORA_BIPV_v2_julio2026.docx
+++ b/MANUAL_CALCULADORA_BIPV_v2_julio2026.docx
@@ -194,6 +194,351 @@
           <w:sz w:val="20"/>
         </w:rPr>
         <w:t>Si η o PR quedan en 0, la pestaña 📊 Producción mostrará 0 kWh aunque la POA sea correcta.</w:t>
+      </w:r>
+    </w:p>
+    <w:p>
+      <w:r>
+        <w:rPr>
+          <w:rFonts w:ascii="Calibri" w:hAnsi="Calibri"/>
+          <w:b w:val="0"/>
+          <w:i/>
+          <w:color w:val="555555"/>
+          <w:sz w:val="21"/>
+        </w:rPr>
+        <w:t>Recomendación práctica: empieza siempre sin CSV para ver la producción base. Si el proyecto tiene obstáculos reales (edificios vecinos, voladizos, antenas), genera el CSV de la Calculadora de Sombreado y cárgalo en Pág. 5 para el análisis completo.</w:t>
+      </w:r>
+    </w:p>
+    <w:p>
+      <w:r>
+        <w:rPr>
+          <w:rFonts w:ascii="Calibri" w:hAnsi="Calibri"/>
+          <w:b w:val="0"/>
+          <w:i w:val="0"/>
+          <w:sz w:val="21"/>
+        </w:rPr>
+      </w:r>
+    </w:p>
+    <w:p>
+      <w:pPr>
+        <w:shd w:val="clear" w:color="auto" w:fill="FFE0CC"/>
+        <w:spacing w:before="80" w:after="80"/>
+        <w:ind w:left="216" w:right="216"/>
+      </w:pPr>
+      <w:r>
+        <w:rPr>
+          <w:rFonts w:ascii="Calibri" w:hAnsi="Calibri"/>
+          <w:sz w:val="20"/>
+        </w:rPr>
+        <w:t>▶  Flujo CON CSV (análisis de bypass completo):</w:t>
+        <w:br/>
+        <w:t>bipv.innovacionquimica.com.co (exportar CSV con columna Fachada) → Pág. 5 Mismatch (cargar CSV + simular bypass) → Pág. 6 Producción (E_ac corregida) → Vista 3D ⚙️ → 🎨 (modo FS del CSV activo) → 📊 (FS por superficie)</w:t>
+        <w:br/>
+        <w:t>Resultado: además de la producción, obtienes las pérdidas reales por bypass y el factor de sombra superpuesto sobre cada superficie en el modelo 3D.</w:t>
+      </w:r>
+    </w:p>
+    <w:p>
+      <w:pPr>
+        <w:shd w:val="clear" w:color="auto" w:fill="D6EAF8"/>
+        <w:spacing w:before="80" w:after="80"/>
+        <w:ind w:left="216" w:right="216"/>
+      </w:pPr>
+      <w:r>
+        <w:rPr>
+          <w:rFonts w:ascii="Calibri" w:hAnsi="Calibri"/>
+          <w:sz w:val="20"/>
+        </w:rPr>
+        <w:t>▶  Flujo SIN CSV (solo PVGIS) — recomendado para empezar:</w:t>
+        <w:br/>
+        <w:t>Pág. 2 Recurso Solar (botón PVGIS) → Vista 3D ⚙️ Superficies → 🎨 Vista 3D (colores POA) → 📊 Producción → 🌞 Trayectoria Solar</w:t>
+        <w:br/>
+        <w:t>Resultado: producción kWh/año por superficie, orientación óptima, comparativo fachada vs techo.</w:t>
+      </w:r>
+    </w:p>
+    <w:p>
+      <w:pPr>
+        <w:spacing w:before="160"/>
+      </w:pPr>
+      <w:r>
+        <w:rPr>
+          <w:rFonts w:ascii="Calibri" w:hAnsi="Calibri"/>
+          <w:b/>
+          <w:color w:val="206A4A"/>
+          <w:sz w:val="22"/>
+        </w:rPr>
+        <w:t>Flujos de trabajo según disponibilidad del CSV</w:t>
+      </w:r>
+    </w:p>
+    <w:p>
+      <w:r>
+        <w:rPr>
+          <w:rFonts w:ascii="Calibri" w:hAnsi="Calibri"/>
+          <w:b w:val="0"/>
+          <w:i w:val="0"/>
+          <w:sz w:val="21"/>
+        </w:rPr>
+      </w:r>
+    </w:p>
+    <w:tbl>
+      <w:tblPr>
+        <w:tblStyle w:val="TableGrid"/>
+        <w:tblW w:type="auto" w:w="0"/>
+        <w:jc w:val="left"/>
+        <w:tblLook w:firstColumn="1" w:firstRow="1" w:lastColumn="0" w:lastRow="0" w:noHBand="0" w:noVBand="1" w:val="04A0"/>
+      </w:tblPr>
+      <w:tblGrid>
+        <w:gridCol w:w="2880"/>
+        <w:gridCol w:w="2880"/>
+        <w:gridCol w:w="2880"/>
+      </w:tblGrid>
+      <w:tr>
+        <w:tc>
+          <w:tcPr>
+            <w:tcW w:type="dxa" w:w="3456"/>
+            <w:shd w:val="clear" w:color="auto" w:fill="1A568C"/>
+          </w:tcPr>
+          <w:p>
+            <w:r>
+              <w:rPr>
+                <w:rFonts w:ascii="Calibri" w:hAnsi="Calibri"/>
+                <w:b/>
+                <w:color w:val="FFFFFF"/>
+                <w:sz w:val="19"/>
+              </w:rPr>
+              <w:t>Situación</w:t>
+            </w:r>
+          </w:p>
+        </w:tc>
+        <w:tc>
+          <w:tcPr>
+            <w:tcW w:type="dxa" w:w="1728"/>
+            <w:shd w:val="clear" w:color="auto" w:fill="1A568C"/>
+          </w:tcPr>
+          <w:p>
+            <w:r>
+              <w:rPr>
+                <w:rFonts w:ascii="Calibri" w:hAnsi="Calibri"/>
+                <w:b/>
+                <w:color w:val="FFFFFF"/>
+                <w:sz w:val="19"/>
+              </w:rPr>
+              <w:t>¿Necesitas el CSV?</w:t>
+            </w:r>
+          </w:p>
+        </w:tc>
+        <w:tc>
+          <w:tcPr>
+            <w:tcW w:type="dxa" w:w="4032"/>
+            <w:shd w:val="clear" w:color="auto" w:fill="1A568C"/>
+          </w:tcPr>
+          <w:p>
+            <w:r>
+              <w:rPr>
+                <w:rFonts w:ascii="Calibri" w:hAnsi="Calibri"/>
+                <w:b/>
+                <w:color w:val="FFFFFF"/>
+                <w:sz w:val="19"/>
+              </w:rPr>
+              <w:t>Qué obtienes</w:t>
+            </w:r>
+          </w:p>
+        </w:tc>
+      </w:tr>
+      <w:tr>
+        <w:tc>
+          <w:tcPr>
+            <w:tcW w:type="dxa" w:w="3456"/>
+            <w:shd w:val="clear" w:color="auto" w:fill="EAF2FB"/>
+          </w:tcPr>
+          <w:p>
+            <w:r>
+              <w:rPr>
+                <w:rFonts w:ascii="Calibri" w:hAnsi="Calibri"/>
+                <w:sz w:val="19"/>
+              </w:rPr>
+              <w:t>Solo quieres ver producción por superficie y orientación óptima</w:t>
+            </w:r>
+          </w:p>
+        </w:tc>
+        <w:tc>
+          <w:tcPr>
+            <w:tcW w:type="dxa" w:w="1728"/>
+            <w:shd w:val="clear" w:color="auto" w:fill="EAF2FB"/>
+          </w:tcPr>
+          <w:p>
+            <w:r>
+              <w:rPr>
+                <w:rFonts w:ascii="Calibri" w:hAnsi="Calibri"/>
+                <w:sz w:val="19"/>
+              </w:rPr>
+              <w:t>❌ No</w:t>
+            </w:r>
+          </w:p>
+        </w:tc>
+        <w:tc>
+          <w:tcPr>
+            <w:tcW w:type="dxa" w:w="4032"/>
+            <w:shd w:val="clear" w:color="auto" w:fill="EAF2FB"/>
+          </w:tcPr>
+          <w:p>
+            <w:r>
+              <w:rPr>
+                <w:rFonts w:ascii="Calibri" w:hAnsi="Calibri"/>
+                <w:sz w:val="19"/>
+              </w:rPr>
+              <w:t>⚙️ POA por superficie + 🎨 Vista 3D (colores por POA) + 📊 Producción + 🌞 Trayectoria solar — todo funciona</w:t>
+            </w:r>
+          </w:p>
+        </w:tc>
+      </w:tr>
+      <w:tr>
+        <w:tc>
+          <w:tcPr>
+            <w:tcW w:type="dxa" w:w="3456"/>
+          </w:tcPr>
+          <w:p>
+            <w:r>
+              <w:rPr>
+                <w:rFonts w:ascii="Calibri" w:hAnsi="Calibri"/>
+                <w:sz w:val="19"/>
+              </w:rPr>
+              <w:t>Quieres ver el sombreado real coloreado sobre el modelo 3D</w:t>
+            </w:r>
+          </w:p>
+        </w:tc>
+        <w:tc>
+          <w:tcPr>
+            <w:tcW w:type="dxa" w:w="1728"/>
+          </w:tcPr>
+          <w:p>
+            <w:r>
+              <w:rPr>
+                <w:rFonts w:ascii="Calibri" w:hAnsi="Calibri"/>
+                <w:sz w:val="19"/>
+              </w:rPr>
+              <w:t>✅ Sí (opcional)</w:t>
+            </w:r>
+          </w:p>
+        </w:tc>
+        <w:tc>
+          <w:tcPr>
+            <w:tcW w:type="dxa" w:w="4032"/>
+          </w:tcPr>
+          <w:p>
+            <w:r>
+              <w:rPr>
+                <w:rFonts w:ascii="Calibri" w:hAnsi="Calibri"/>
+                <w:sz w:val="19"/>
+              </w:rPr>
+              <w:t>El modo «FS del CSV» en 🎨 se activa y colorea verde→rojo según factor de sombra</w:t>
+            </w:r>
+          </w:p>
+        </w:tc>
+      </w:tr>
+      <w:tr>
+        <w:tc>
+          <w:tcPr>
+            <w:tcW w:type="dxa" w:w="3456"/>
+            <w:shd w:val="clear" w:color="auto" w:fill="EAF2FB"/>
+          </w:tcPr>
+          <w:p>
+            <w:r>
+              <w:rPr>
+                <w:rFonts w:ascii="Calibri" w:hAnsi="Calibri"/>
+                <w:sz w:val="19"/>
+              </w:rPr>
+              <w:t>Quieres calcular las pérdidas reales por bypass diodes</w:t>
+            </w:r>
+          </w:p>
+        </w:tc>
+        <w:tc>
+          <w:tcPr>
+            <w:tcW w:type="dxa" w:w="1728"/>
+            <w:shd w:val="clear" w:color="auto" w:fill="EAF2FB"/>
+          </w:tcPr>
+          <w:p>
+            <w:r>
+              <w:rPr>
+                <w:rFonts w:ascii="Calibri" w:hAnsi="Calibri"/>
+                <w:sz w:val="19"/>
+              </w:rPr>
+              <w:t>✅ Sí (obligatorio para Pág. 5)</w:t>
+            </w:r>
+          </w:p>
+        </w:tc>
+        <w:tc>
+          <w:tcPr>
+            <w:tcW w:type="dxa" w:w="4032"/>
+            <w:shd w:val="clear" w:color="auto" w:fill="EAF2FB"/>
+          </w:tcPr>
+          <w:p>
+            <w:r>
+              <w:rPr>
+                <w:rFonts w:ascii="Calibri" w:hAnsi="Calibri"/>
+                <w:sz w:val="19"/>
+              </w:rPr>
+              <w:t>El CSV es obligatorio en Página 5 Mismatch. Luego Vista 3D puede mostrar el FS de ese CSV</w:t>
+            </w:r>
+          </w:p>
+        </w:tc>
+      </w:tr>
+    </w:tbl>
+    <w:p>
+      <w:r>
+        <w:rPr>
+          <w:rFonts w:ascii="Calibri" w:hAnsi="Calibri"/>
+          <w:b w:val="0"/>
+          <w:i w:val="0"/>
+          <w:sz w:val="21"/>
+        </w:rPr>
+      </w:r>
+    </w:p>
+    <w:p>
+      <w:r>
+        <w:rPr>
+          <w:rFonts w:ascii="Calibri" w:hAnsi="Calibri"/>
+          <w:b w:val="0"/>
+          <w:i w:val="0"/>
+          <w:sz w:val="21"/>
+        </w:rPr>
+        <w:t>El CSV de sombreado (bipv.innovacionquimica.com.co) es un complemento que agrega la capa de factor de sombra real sobre cada superficie. Sin él, Vista 3D trabaja perfectamente con el recurso solar calculado por PVGIS.</w:t>
+      </w:r>
+    </w:p>
+    <w:p>
+      <w:r>
+        <w:rPr>
+          <w:rFonts w:ascii="Calibri" w:hAnsi="Calibri"/>
+          <w:b w:val="0"/>
+          <w:i w:val="0"/>
+          <w:sz w:val="21"/>
+        </w:rPr>
+      </w:r>
+    </w:p>
+    <w:p>
+      <w:pPr>
+        <w:shd w:val="clear" w:color="auto" w:fill="D5F5E3"/>
+        <w:spacing w:before="80" w:after="80"/>
+        <w:ind w:left="216" w:right="216"/>
+      </w:pPr>
+      <w:r>
+        <w:rPr>
+          <w:rFonts w:ascii="Calibri" w:hAnsi="Calibri"/>
+          <w:sz w:val="20"/>
+        </w:rPr>
+        <w:t>RESPUESTA CORTA: NO. El CSV es opcional para Vista 3D. La página funciona completa con solo el TMY de PVGIS (botón azul de Recurso Solar).</w:t>
+      </w:r>
+    </w:p>
+    <w:p>
+      <w:pPr>
+        <w:spacing w:before="160"/>
+      </w:pPr>
+      <w:r>
+        <w:rPr>
+          <w:rFonts w:ascii="Calibri" w:hAnsi="Calibri"/>
+          <w:b/>
+          <w:color w:val="206A4A"/>
+          <w:sz w:val="22"/>
+        </w:rPr>
+        <w:t>¿Necesito el CSV de la Calculadora de Sombreado para usar Vista 3D?</w:t>
       </w:r>
     </w:p>
     <w:p>

</xml_diff>